<commit_message>
Correct T3 terminology to unilateral write-off throughout buyer product
</commit_message>
<xml_diff>
--- a/products-storage/17-odnostoronniy-akt-i-zachet/01-poryadok-deystviy.docx
+++ b/products-storage/17-odnostoronniy-akt-i-zachet/01-poryadok-deystviy.docx
@@ -7,7 +7,7 @@
         <w:pStyle w:val="Title"/>
       </w:pPr>
       <w:r>
-        <w:t>Порядок действий при получении акта или уведомления о зачёте</w:t>
+        <w:t>Порядок действий при получении акта или уведомления о списании в одностороннем порядке</w:t>
       </w:r>
     </w:p>
     <w:p>
@@ -156,7 +156,7 @@
                 <w:b w:val="0"/>
                 <w:sz w:val="17"/>
               </w:rPr>
-              <w:t>Уведомление о зачёте либо удержании суммы из оплаты</w:t>
+              <w:t>Уведомление о списании суммы из оплаты в одностороннем порядке</w:t>
             </w:r>
           </w:p>
         </w:tc>
@@ -175,7 +175,7 @@
                 <w:b w:val="0"/>
                 <w:sz w:val="17"/>
               </w:rPr>
-              <w:t>03 Возражения на зачёт или удержание</w:t>
+              <w:t>03 Возражения на списание в одностороннем порядке</w:t>
             </w:r>
           </w:p>
         </w:tc>
@@ -231,7 +231,7 @@
         <w:rPr>
           <w:b w:val="0"/>
         </w:rPr>
-        <w:t>Проверьте содержание документа, а не только его название. Для зачёта встречных требований, договорного удержания и определения сальдо могут действовать разные условия; отберите доводы по фактической конструкции.</w:t>
+        <w:t>Списание в одностороннем порядке — уменьшение заказчиком причитающейся Подрядчику оплаты. Проверьте основание: прекращение встречных требований по статье 410 ГК РФ, договорное удержание или определение сальдо. Отберите доводы по применённому механизму.</w:t>
       </w:r>
     </w:p>
     <w:p>

</xml_diff>